<commit_message>
Refactor redaction logic to improve fallback handling and enhance fake data generation consistency
</commit_message>
<xml_diff>
--- a/data/output/redacted_synthetic.docx
+++ b/data/output/redacted_synthetic.docx
@@ -48,55 +48,55 @@
           <w:sz w:val="20"/>
           <w:szCs w:val="20"/>
         </w:rPr>
-        <w:t xml:space="preserve">Rashi Patil: Leona Conroy should become fake</w:t>
-      </w:r>
-    </w:p>
-    <w:p>
-      <w:pPr>
-        <w:spacing w:after="60"/>
-      </w:pPr>
-      <w:r>
-        <w:rPr>
-          <w:sz w:val="20"/>
-          <w:szCs w:val="20"/>
-        </w:rPr>
-        <w:t xml:space="preserve">undefined: undefined</w:t>
-      </w:r>
-    </w:p>
-    <w:p>
-      <w:pPr>
-        <w:spacing w:after="60"/>
-      </w:pPr>
-      <w:r>
-        <w:rPr>
-          <w:sz w:val="20"/>
-          <w:szCs w:val="20"/>
-        </w:rPr>
-        <w:t xml:space="preserve">Clinton Oberbrunner</w:t>
-      </w:r>
-    </w:p>
-    <w:p>
-      <w:pPr>
-        <w:spacing w:after="60"/>
-      </w:pPr>
-      <w:r>
-        <w:rPr>
-          <w:sz w:val="20"/>
-          <w:szCs w:val="20"/>
-        </w:rPr>
-        <w:t xml:space="preserve">undefined: undefined</w:t>
-      </w:r>
-    </w:p>
-    <w:p>
-      <w:pPr>
-        <w:spacing w:after="60"/>
-      </w:pPr>
-      <w:r>
-        <w:rPr>
-          <w:sz w:val="20"/>
-          <w:szCs w:val="20"/>
-        </w:rPr>
-        <w:t xml:space="preserve">+91 48 8096 7973: +91 50 1430 5709</w:t>
+        <w:t xml:space="preserve">Rashi Patil: Julia Kemmer should become fake</w:t>
+      </w:r>
+    </w:p>
+    <w:p>
+      <w:pPr>
+        <w:spacing w:after="60"/>
+      </w:pPr>
+      <w:r>
+        <w:rPr>
+          <w:sz w:val="20"/>
+          <w:szCs w:val="20"/>
+        </w:rPr>
+        <w:t xml:space="preserve">shawn42@gmail.com: chelsea_kihn-reilly32@hotmail.com</w:t>
+      </w:r>
+    </w:p>
+    <w:p>
+      <w:pPr>
+        <w:spacing w:after="60"/>
+      </w:pPr>
+      <w:r>
+        <w:rPr>
+          <w:sz w:val="20"/>
+          <w:szCs w:val="20"/>
+        </w:rPr>
+        <w:t xml:space="preserve">Geraldine Price Jr.</w:t>
+      </w:r>
+    </w:p>
+    <w:p>
+      <w:pPr>
+        <w:spacing w:after="60"/>
+      </w:pPr>
+      <w:r>
+        <w:rPr>
+          <w:sz w:val="20"/>
+          <w:szCs w:val="20"/>
+        </w:rPr>
+        <w:t xml:space="preserve">eda.robel43@yahoo.com: larry.stracke@gmail.com</w:t>
+      </w:r>
+    </w:p>
+    <w:p>
+      <w:pPr>
+        <w:spacing w:after="60"/>
+      </w:pPr>
+      <w:r>
+        <w:rPr>
+          <w:sz w:val="20"/>
+          <w:szCs w:val="20"/>
+        </w:rPr>
+        <w:t xml:space="preserve">+91 66 2165 6110: +91 44 6989 3961</w:t>
       </w:r>
     </w:p>
     <w:p/>
@@ -121,19 +121,19 @@
           <w:sz w:val="20"/>
           <w:szCs w:val="20"/>
         </w:rPr>
-        <w:t xml:space="preserve">Ticket #12345 created by Rashi Patil (undefined) on 2023-01-15</w:t>
-      </w:r>
-    </w:p>
-    <w:p>
-      <w:pPr>
-        <w:spacing w:after="60"/>
-      </w:pPr>
-      <w:r>
-        <w:rPr>
-          <w:sz w:val="20"/>
-          <w:szCs w:val="20"/>
-        </w:rPr>
-        <w:t xml:space="preserve">Contact: +91 48 8096 7973, Alternate: +91 84 4520 4092</w:t>
+        <w:t xml:space="preserve">Ticket #12345 created by Rashi Patil (shawn42@gmail.com) on 2023-01-15</w:t>
+      </w:r>
+    </w:p>
+    <w:p>
+      <w:pPr>
+        <w:spacing w:after="60"/>
+      </w:pPr>
+      <w:r>
+        <w:rPr>
+          <w:sz w:val="20"/>
+          <w:szCs w:val="20"/>
+        </w:rPr>
+        <w:t xml:space="preserve">Contact: +91 66 2165 6110, Alternate: +91 11 3956 5691</w:t>
       </w:r>
     </w:p>
     <w:p>
@@ -157,103 +157,103 @@
           <w:sz w:val="20"/>
           <w:szCs w:val="20"/>
         </w:rPr>
-        <w:t xml:space="preserve">8849 Kariane Stravenue, Sheilaworth, Missouri - 761078, India</w:t>
-      </w:r>
-    </w:p>
-    <w:p>
-      <w:pPr>
-        <w:spacing w:after="60"/>
-      </w:pPr>
-      <w:r>
-        <w:rPr>
-          <w:sz w:val="20"/>
-          <w:szCs w:val="20"/>
-        </w:rPr>
-        <w:t xml:space="preserve">12078 Beatrice Wells, Bradhaven, Colorado - 489661, India</w:t>
-      </w:r>
-    </w:p>
-    <w:p>
-      <w:pPr>
-        <w:spacing w:after="60"/>
-      </w:pPr>
-      <w:r>
-        <w:rPr>
-          <w:sz w:val="20"/>
-          <w:szCs w:val="20"/>
-        </w:rPr>
-        <w:t xml:space="preserve">Email chain: undefined, undefined, undefined</w:t>
-      </w:r>
-    </w:p>
-    <w:p>
-      <w:pPr>
-        <w:spacing w:after="60"/>
-      </w:pPr>
-      <w:r>
-        <w:rPr>
-          <w:sz w:val="20"/>
-          <w:szCs w:val="20"/>
-        </w:rPr>
-        <w:t xml:space="preserve">Promoter: Kushal Subbayya Hegde, Pushpa Kushal Hegde, Leslie Gibson</w:t>
-      </w:r>
-    </w:p>
-    <w:p>
-      <w:pPr>
-        <w:spacing w:after="60"/>
-      </w:pPr>
-      <w:r>
-        <w:rPr>
-          <w:sz w:val="20"/>
-          <w:szCs w:val="20"/>
-        </w:rPr>
-        <w:t xml:space="preserve">Company Secondary: O'Connell Group LLP, Koelpin and Sons Private Limited</w:t>
-      </w:r>
-    </w:p>
-    <w:p>
-      <w:pPr>
-        <w:spacing w:after="60"/>
-      </w:pPr>
-      <w:r>
-        <w:rPr>
-          <w:sz w:val="20"/>
-          <w:szCs w:val="20"/>
-        </w:rPr>
-        <w:t xml:space="preserve">SSN: 458-80-1155 (US Citizen), 436-36-8475</w:t>
-      </w:r>
-    </w:p>
-    <w:p>
-      <w:pPr>
-        <w:spacing w:after="60"/>
-      </w:pPr>
-      <w:r>
-        <w:rPr>
-          <w:sz w:val="20"/>
-          <w:szCs w:val="20"/>
-        </w:rPr>
-        <w:t xml:space="preserve">Credit Card: 3291-3176-4948-4912 (Visa test), 3749-0715-8126-9368 (Mastercard test), invalid should not redact: 1234-5678-9012-3456</w:t>
-      </w:r>
-    </w:p>
-    <w:p>
-      <w:pPr>
-        <w:spacing w:after="60"/>
-      </w:pPr>
-      <w:r>
-        <w:rPr>
-          <w:sz w:val="20"/>
-          <w:szCs w:val="20"/>
-        </w:rPr>
-        <w:t xml:space="preserve">IP Address: 11.220.170.101 internal, 132.45.30.52 router, 184.33.95.246, 185.90.114.131 public DNS</w:t>
-      </w:r>
-    </w:p>
-    <w:p>
-      <w:pPr>
-        <w:spacing w:after="60"/>
-      </w:pPr>
-      <w:r>
-        <w:rPr>
-          <w:sz w:val="20"/>
-          <w:szCs w:val="20"/>
-        </w:rPr>
-        <w:t xml:space="preserve">07/05/1967, 13/01/1999, Born on: Jan 5, 1978</w:t>
+        <w:t xml:space="preserve">948 Woodside, Urbana, Minnesota - 985708, India</w:t>
+      </w:r>
+    </w:p>
+    <w:p>
+      <w:pPr>
+        <w:spacing w:after="60"/>
+      </w:pPr>
+      <w:r>
+        <w:rPr>
+          <w:sz w:val="20"/>
+          <w:szCs w:val="20"/>
+        </w:rPr>
+        <w:t xml:space="preserve">90623 Lake Drive, Nienowshire, Georgia - 828857, India</w:t>
+      </w:r>
+    </w:p>
+    <w:p>
+      <w:pPr>
+        <w:spacing w:after="60"/>
+      </w:pPr>
+      <w:r>
+        <w:rPr>
+          <w:sz w:val="20"/>
+          <w:szCs w:val="20"/>
+        </w:rPr>
+        <w:t xml:space="preserve">Email chain: brock.towne@hotmail.com, jonathan45@hotmail.com, erica94@gmail.com</w:t>
+      </w:r>
+    </w:p>
+    <w:p>
+      <w:pPr>
+        <w:spacing w:after="60"/>
+      </w:pPr>
+      <w:r>
+        <w:rPr>
+          <w:sz w:val="20"/>
+          <w:szCs w:val="20"/>
+        </w:rPr>
+        <w:t xml:space="preserve">Promoter: Kushal Subbayya Hegde, Pushpa Kushal Hegde, Laurine Zemlak</w:t>
+      </w:r>
+    </w:p>
+    <w:p>
+      <w:pPr>
+        <w:spacing w:after="60"/>
+      </w:pPr>
+      <w:r>
+        <w:rPr>
+          <w:sz w:val="20"/>
+          <w:szCs w:val="20"/>
+        </w:rPr>
+        <w:t xml:space="preserve">Company Secondary: Torp, Bergstrom and Oberbrunner LLP, Witting LLC LLP</w:t>
+      </w:r>
+    </w:p>
+    <w:p>
+      <w:pPr>
+        <w:spacing w:after="60"/>
+      </w:pPr>
+      <w:r>
+        <w:rPr>
+          <w:sz w:val="20"/>
+          <w:szCs w:val="20"/>
+        </w:rPr>
+        <w:t xml:space="preserve">SSN: 747-07-2098 (US Citizen), 169-48-7802</w:t>
+      </w:r>
+    </w:p>
+    <w:p>
+      <w:pPr>
+        <w:spacing w:after="60"/>
+      </w:pPr>
+      <w:r>
+        <w:rPr>
+          <w:sz w:val="20"/>
+          <w:szCs w:val="20"/>
+        </w:rPr>
+        <w:t xml:space="preserve">Credit Card: 8733-7540-5715-0903 (Visa test), 1612-5219-4973-2110 (Mastercard test), invalid should not redact: 1234-5678-9012-3456</w:t>
+      </w:r>
+    </w:p>
+    <w:p>
+      <w:pPr>
+        <w:spacing w:after="60"/>
+      </w:pPr>
+      <w:r>
+        <w:rPr>
+          <w:sz w:val="20"/>
+          <w:szCs w:val="20"/>
+        </w:rPr>
+        <w:t xml:space="preserve">IP Address: 124.233.167.49 internal, 181.35.111.153 router, 110.140.101.63, 74.63.134.122 public DNS</w:t>
+      </w:r>
+    </w:p>
+    <w:p>
+      <w:pPr>
+        <w:spacing w:after="60"/>
+      </w:pPr>
+      <w:r>
+        <w:rPr>
+          <w:sz w:val="20"/>
+          <w:szCs w:val="20"/>
+        </w:rPr>
+        <w:t xml:space="preserve">17/04/1978, 22/10/1990, Born on: Jan 5, 1978</w:t>
       </w:r>
     </w:p>
     <w:p>

</xml_diff>